<commit_message>
Agregar motivación y descripción de variables en Sección 7 (SARIMAX)
- Reescribir intro de Sección 7: explica que H4 fue rechazada (precipitación no
  significativa) y que eso motiva explorar temperatura y feriados como alternativas
- Párrafo de temperatura: descripción de la variable (Open-Meteo, ciclo estacional
  25°C verano / 11°C invierno), hipótesis, referencia a Figura 19
- Párrafo de feriados: descripción (calendario oficial ARG), hipótesis (viajes
  laborales/académicos), referencia a Figura 20
- Captions Figura 19 y Figura 20 insertados como placeholders (el profe debe insertar
  las imágenes del notebook en esas posiciones)
- Estructura resultante: motivación → temp + Fig 19 → feriados + Fig 20 → 7.1 Estimación

Co-Authored-By: Claude Sonnet 4.6 <noreply@anthropic.com>
</commit_message>
<xml_diff>
--- a/Archivos finales/TP_AST_Version_Final.docx
+++ b/Archivos finales/TP_AST_Version_Final.docx
@@ -18330,7 +18330,7 @@
         <w:rPr>
           <w:lang w:val="es-AR"/>
         </w:rPr>
-        <w:t>Con el objeto de evaluar si la incorporación de variables externas mejora la capacidad explicativa del modelo de demanda de subte, se extendió la especificación SARIMA hacia un modelo SARIMAX, en el cual la dinámica de la serie endógena se complementa con información proveniente de regresores exógenos observables. La serie principal seleccionada para este análisis es el uso mensual del subte de la Ciudad de Buenos Aires, por constituir el indicador más directo de la demanda de transporte público masivo en el área metropolitana.</w:t>
+        <w:t>Los resultados del análisis principal (Sección 6) mostraron que la precipitación mensual no tiene efecto significativo sobre la demanda del subte ni el flujo vehicular en peajes (p &gt; 0,38 en ambas series), rechazándose así la hipótesis H4. Este resultado es consistente con la escala temporal mensual: la agregación mensual diluye los episodios de lluvia de corta duración, de modo que el promedio mensual no alcanza a distinguir el comportamiento modal de los usuarios. Ante este hallazgo, se exploró la incorporación de variables alternativas con mayor sustento teórico a escala mensual: la temperatura y los días feriados. A tal efecto, se extendió la especificación SARIMA hacia un modelo SARIMAX, en el cual la dinámica de la serie endógena se complementa con información proveniente de regresores exógenos observables. El análisis se focaliza en la serie de pasajeros de subte, por constituir el indicador más directo de la demanda de transporte público masivo.</w:t>
       </w:r>
     </w:p>
     <w:p>
@@ -18338,7 +18338,25 @@
         <w:spacing w:before="240" w:after="240"/>
       </w:pPr>
       <w:r>
-        <w:t>Como variables exógenas se incorporaron dos regresores con sustento teórico: la temperatura mensual promedio (temp), construida a partir de registros climáticos diarios agregados a nivel mensual, y los feriados mensuales (feriados), obtenidos del calendario oficial de feriados nacionales de la República Argentina (Argentina.gob.ar) y contabilizados por mes entre 2013 y 2025. La hipótesis subyacente es que tanto las condiciones climáticas como los días no laborables inciden de manera directa sobre la demanda de transporte público: temperaturas extremas pueden desincentivar el uso del subte en favor de medios privados, mientras que los feriados reducen los viajes asociados al ciclo laboral y académico.</w:t>
+        <w:t>Se incorporaron dos regresores exógenos. La temperatura mensual promedio (temp_C) se obtuvo de Open-Meteo para la Ciudad de Buenos Aires y registra el ciclo estacional característico de la región: máximos de aproximadamente 25 °C en verano (enero–febrero) y mínimos de 10–11 °C en invierno (junio–julio). A diferencia de la precipitación, la temperatura tiene un ciclo predecible y de duración sostenida a lo largo del mes, lo que refuerza su pertinencia a la escala temporal utilizada. La hipótesis es que temperaturas extremas —tanto calor intenso como frío marcado— pueden desincentivar el uso del subte en favor de medios privados con climatización. La Figura 19 presenta la evolución temporal de la temperatura mensual promedio para el período analizado.</w:t>
+      </w:r>
+    </w:p>
+    <w:p>
+      <w:r>
+        <w:t xml:space="preserve">Figura 19. Evolución temporal de la temperatura mensual promedio (°C) en la Ciudad de Buenos Aires. Período jun 2013 – dic 2025.</w:t>
+      </w:r>
+    </w:p>
+    <w:p>
+      <w:pPr>
+        <w:spacing w:before="240" w:after="240"/>
+      </w:pPr>
+      <w:r>
+        <w:t xml:space="preserve">La variable feriados_n contabiliza los días feriados nacionales por mes, construida a partir del calendario oficial de la República Argentina (Argentina.gob.ar) para el período 2013–2025. Los feriados reducen directamente los viajes de motivo laboral y académico, que representan la mayor parte de los viajes en subte. A diferencia de la temperatura, cuyo efecto puede ser gradual, los feriados eliminan días completos de demanda de pico. La Figura 20 presenta la distribución del número de días feriados por mes a lo largo del período analizado, destacándose los meses con mayor concentración de feriados (enero, mayo, julio y octubre).</w:t>
+      </w:r>
+    </w:p>
+    <w:p>
+      <w:r>
+        <w:t xml:space="preserve">Figura 20. Número de días feriados nacionales por mes. Período jun 2013 – dic 2025. Los meses con mayor concentración son enero, mayo, julio y octubre.</w:t>
       </w:r>
     </w:p>
     <w:p>

</xml_diff>